<commit_message>
Add §4.11 items 26–31 from the adversarial read's omission audit
Six new items, appended so existing numbers hold: dissent and escalation (26),
sign-offs and missing perspectives (27), power gradients and attribution (28),
partner confidential material (29), reversibility (30), and contingencies
(31). Ten existing items amended. One new blocking trigger, in item 29:
credentials, unremediated vulnerability detail, or a customer's system
configuration planned onto a board or summary wider than need-to-know. The
safety checker leaves item 29 to the workshop checker. Scenario F and the
workshop plan template gain the matching fields. Verified in four blind runs
(testing repo, adversarial-reads/workshop-4.11-2026-10.md, "Omission pass").

Co-Authored-By: Claude Opus 5.5 <noreply@anthropic.com>
</commit_message>
<xml_diff>
--- a/templates/docx/12-workshop-plan.docx
+++ b/templates/docx/12-workshop-plan.docx
@@ -490,6 +490,36 @@
           <w:color w:val="1B1B1B"/>
           <w:sz w:val="17"/>
         </w:rPr>
+        <w:t>Reversibility:          [hard to reverse: why, and the sign-offs that follows]</w:t>
+      </w:r>
+    </w:p>
+    <w:p>
+      <w:pPr>
+        <w:spacing w:before="0" w:after="0"/>
+        <w:ind w:left="216"/>
+        <w:shd w:val="clear" w:fill="F0F0F0"/>
+      </w:pPr>
+      <w:r>
+        <w:rPr>
+          <w:rFonts w:ascii="Roboto Mono" w:hAnsi="Roboto Mono"/>
+          <w:color w:val="1B1B1B"/>
+          <w:sz w:val="17"/>
+        </w:rPr>
+        <w:t xml:space="preserve">                         or [reversible: review date, what would reverse it]</w:t>
+      </w:r>
+    </w:p>
+    <w:p>
+      <w:pPr>
+        <w:spacing w:before="0" w:after="0"/>
+        <w:ind w:left="216"/>
+        <w:shd w:val="clear" w:fill="F0F0F0"/>
+      </w:pPr>
+      <w:r>
+        <w:rPr>
+          <w:rFonts w:ascii="Roboto Mono" w:hAnsi="Roboto Mono"/>
+          <w:color w:val="1B1B1B"/>
+          <w:sz w:val="17"/>
+        </w:rPr>
         <w:t>Attendees:              Role · decision rights · location and time zone</w:t>
       </w:r>
     </w:p>
@@ -521,6 +551,36 @@
           <w:sz w:val="17"/>
         </w:rPr>
         <w:t>Consulted afterwards:   [names, including anyone whose sign-off is needed]</w:t>
+      </w:r>
+    </w:p>
+    <w:p>
+      <w:pPr>
+        <w:spacing w:before="0" w:after="0"/>
+        <w:ind w:left="216"/>
+        <w:shd w:val="clear" w:fill="F0F0F0"/>
+      </w:pPr>
+      <w:r>
+        <w:rPr>
+          <w:rFonts w:ascii="Roboto Mono" w:hAnsi="Roboto Mono"/>
+          <w:color w:val="1B1B1B"/>
+          <w:sz w:val="17"/>
+        </w:rPr>
+        <w:t>Sign-offs needed:       [function, person, status: in the room / before /</w:t>
+      </w:r>
+    </w:p>
+    <w:p>
+      <w:pPr>
+        <w:spacing w:before="0" w:after="0"/>
+        <w:ind w:left="216"/>
+        <w:shd w:val="clear" w:fill="F0F0F0"/>
+      </w:pPr>
+      <w:r>
+        <w:rPr>
+          <w:rFonts w:ascii="Roboto Mono" w:hAnsi="Roboto Mono"/>
+          <w:color w:val="1B1B1B"/>
+          <w:sz w:val="17"/>
+        </w:rPr>
+        <w:t xml:space="preserve">                         after by date / "decided pending review"]</w:t>
       </w:r>
     </w:p>
     <w:p>
@@ -881,6 +941,111 @@
           <w:sz w:val="17"/>
         </w:rPr>
         <w:t xml:space="preserve">  Recording consent:    [from everyone recorded, or not recording]</w:t>
+      </w:r>
+    </w:p>
+    <w:p>
+      <w:pPr>
+        <w:spacing w:before="0" w:after="0"/>
+        <w:ind w:left="216"/>
+        <w:shd w:val="clear" w:fill="F0F0F0"/>
+      </w:pPr>
+      <w:r>
+        <w:rPr>
+          <w:rFonts w:ascii="Roboto Mono" w:hAnsi="Roboto Mono"/>
+          <w:color w:val="1B1B1B"/>
+          <w:sz w:val="17"/>
+        </w:rPr>
+        <w:t xml:space="preserve">  Confidential material: [what partners bring, what reaches the board and the</w:t>
+      </w:r>
+    </w:p>
+    <w:p>
+      <w:pPr>
+        <w:spacing w:before="0" w:after="0"/>
+        <w:ind w:left="216"/>
+        <w:shd w:val="clear" w:fill="F0F0F0"/>
+      </w:pPr>
+      <w:r>
+        <w:rPr>
+          <w:rFonts w:ascii="Roboto Mono" w:hAnsi="Roboto Mono"/>
+          <w:color w:val="1B1B1B"/>
+          <w:sz w:val="17"/>
+        </w:rPr>
+        <w:t xml:space="preserve">                         summary; board, recording, and AI note-taker</w:t>
+      </w:r>
+    </w:p>
+    <w:p>
+      <w:pPr>
+        <w:spacing w:before="0" w:after="0"/>
+        <w:ind w:left="216"/>
+        <w:shd w:val="clear" w:fill="F0F0F0"/>
+      </w:pPr>
+      <w:r>
+        <w:rPr>
+          <w:rFonts w:ascii="Roboto Mono" w:hAnsi="Roboto Mono"/>
+          <w:color w:val="1B1B1B"/>
+          <w:sz w:val="17"/>
+        </w:rPr>
+        <w:t xml:space="preserve">                         approved for it]</w:t>
+      </w:r>
+    </w:p>
+    <w:p>
+      <w:pPr>
+        <w:spacing w:before="0" w:after="0"/>
+        <w:ind w:left="216"/>
+        <w:shd w:val="clear" w:fill="F0F0F0"/>
+      </w:pPr>
+      <w:r>
+        <w:rPr>
+          <w:rFonts w:ascii="Roboto Mono" w:hAnsi="Roboto Mono"/>
+          <w:color w:val="1B1B1B"/>
+          <w:sz w:val="17"/>
+        </w:rPr>
+        <w:t>Access needs:           [asked for by date; what was acted on]</w:t>
+      </w:r>
+    </w:p>
+    <w:p>
+      <w:pPr>
+        <w:spacing w:before="0" w:after="0"/>
+        <w:ind w:left="216"/>
+        <w:shd w:val="clear" w:fill="F0F0F0"/>
+      </w:pPr>
+      <w:r>
+        <w:rPr>
+          <w:rFonts w:ascii="Roboto Mono" w:hAnsi="Roboto Mono"/>
+          <w:color w:val="1B1B1B"/>
+          <w:sz w:val="17"/>
+        </w:rPr>
+        <w:t>If the decision is contested: [objection and response recorded; escalation</w:t>
+      </w:r>
+    </w:p>
+    <w:p>
+      <w:pPr>
+        <w:spacing w:before="0" w:after="0"/>
+        <w:ind w:left="216"/>
+        <w:shd w:val="clear" w:fill="F0F0F0"/>
+      </w:pPr>
+      <w:r>
+        <w:rPr>
+          <w:rFonts w:ascii="Roboto Mono" w:hAnsi="Roboto Mono"/>
+          <w:color w:val="1B1B1B"/>
+          <w:sz w:val="17"/>
+        </w:rPr>
+        <w:t xml:space="preserve">                         path and deadline; whether the decision stands</w:t>
+      </w:r>
+    </w:p>
+    <w:p>
+      <w:pPr>
+        <w:spacing w:before="0" w:after="0"/>
+        <w:ind w:left="216"/>
+        <w:shd w:val="clear" w:fill="F0F0F0"/>
+      </w:pPr>
+      <w:r>
+        <w:rPr>
+          <w:rFonts w:ascii="Roboto Mono" w:hAnsi="Roboto Mono"/>
+          <w:color w:val="1B1B1B"/>
+          <w:sz w:val="17"/>
+        </w:rPr>
+        <w:t xml:space="preserve">                         meanwhile]</w:t>
       </w:r>
     </w:p>
     <w:p>
@@ -1881,10 +2046,11 @@
         <w:tblLook w:firstColumn="1" w:firstRow="1" w:lastColumn="0" w:lastRow="0" w:noHBand="0" w:noVBand="1" w:val="04A0"/>
       </w:tblPr>
       <w:tblGrid>
-        <w:gridCol w:w="2340"/>
-        <w:gridCol w:w="2340"/>
-        <w:gridCol w:w="2340"/>
-        <w:gridCol w:w="2340"/>
+        <w:gridCol w:w="1872"/>
+        <w:gridCol w:w="1872"/>
+        <w:gridCol w:w="1872"/>
+        <w:gridCol w:w="1872"/>
+        <w:gridCol w:w="1872"/>
       </w:tblGrid>
       <w:tr>
         <w:trPr>
@@ -1892,7 +2058,7 @@
         </w:trPr>
         <w:tc>
           <w:tcPr>
-            <w:tcW w:type="dxa" w:w="2340"/>
+            <w:tcW w:type="dxa" w:w="1872"/>
             <w:shd w:fill="F0F0F0"/>
           </w:tcPr>
           <w:p>
@@ -1912,7 +2078,7 @@
         </w:tc>
         <w:tc>
           <w:tcPr>
-            <w:tcW w:type="dxa" w:w="2340"/>
+            <w:tcW w:type="dxa" w:w="1872"/>
             <w:shd w:fill="F0F0F0"/>
           </w:tcPr>
           <w:p>
@@ -1932,7 +2098,7 @@
         </w:tc>
         <w:tc>
           <w:tcPr>
-            <w:tcW w:type="dxa" w:w="2340"/>
+            <w:tcW w:type="dxa" w:w="1872"/>
             <w:shd w:fill="F0F0F0"/>
           </w:tcPr>
           <w:p>
@@ -1952,7 +2118,7 @@
         </w:tc>
         <w:tc>
           <w:tcPr>
-            <w:tcW w:type="dxa" w:w="2340"/>
+            <w:tcW w:type="dxa" w:w="1872"/>
             <w:shd w:fill="F0F0F0"/>
           </w:tcPr>
           <w:p>
@@ -1970,11 +2136,31 @@
             </w:r>
           </w:p>
         </w:tc>
+        <w:tc>
+          <w:tcPr>
+            <w:tcW w:type="dxa" w:w="1872"/>
+            <w:shd w:fill="F0F0F0"/>
+          </w:tcPr>
+          <w:p>
+            <w:pPr>
+              <w:spacing w:before="30" w:after="30"/>
+            </w:pPr>
+            <w:r>
+              <w:rPr>
+                <w:rFonts w:ascii="Public Sans" w:hAnsi="Public Sans"/>
+                <w:b/>
+                <w:color w:val="1B1B1B"/>
+                <w:sz w:val="21"/>
+              </w:rPr>
+              <w:t>Objection and response</w:t>
+            </w:r>
+          </w:p>
+        </w:tc>
       </w:tr>
       <w:tr>
         <w:tc>
           <w:tcPr>
-            <w:tcW w:type="dxa" w:w="2340"/>
+            <w:tcW w:type="dxa" w:w="1872"/>
           </w:tcPr>
           <w:p>
             <w:pPr>
@@ -1991,7 +2177,7 @@
         </w:tc>
         <w:tc>
           <w:tcPr>
-            <w:tcW w:type="dxa" w:w="2340"/>
+            <w:tcW w:type="dxa" w:w="1872"/>
           </w:tcPr>
           <w:p>
             <w:pPr>
@@ -2008,7 +2194,7 @@
         </w:tc>
         <w:tc>
           <w:tcPr>
-            <w:tcW w:type="dxa" w:w="2340"/>
+            <w:tcW w:type="dxa" w:w="1872"/>
           </w:tcPr>
           <w:p>
             <w:pPr>
@@ -2025,7 +2211,24 @@
         </w:tc>
         <w:tc>
           <w:tcPr>
-            <w:tcW w:type="dxa" w:w="2340"/>
+            <w:tcW w:type="dxa" w:w="1872"/>
+          </w:tcPr>
+          <w:p>
+            <w:pPr>
+              <w:spacing w:before="30" w:after="30"/>
+            </w:pPr>
+            <w:r>
+              <w:rPr>
+                <w:rFonts w:ascii="Public Sans" w:hAnsi="Public Sans"/>
+                <w:b w:val="0"/>
+                <w:sz w:val="21"/>
+              </w:rPr>
+            </w:r>
+          </w:p>
+        </w:tc>
+        <w:tc>
+          <w:tcPr>
+            <w:tcW w:type="dxa" w:w="1872"/>
           </w:tcPr>
           <w:p>
             <w:pPr>
@@ -2738,7 +2941,22 @@
           <w:color w:val="1B1B1B"/>
           <w:sz w:val="17"/>
         </w:rPr>
-        <w:t>Contingencies:     if the room stalls / splits / runs long</w:t>
+        <w:t>Contingencies:     if the room stalls / splits into two camps / can't decide</w:t>
+      </w:r>
+    </w:p>
+    <w:p>
+      <w:pPr>
+        <w:spacing w:before="0" w:after="0"/>
+        <w:ind w:left="216"/>
+        <w:shd w:val="clear" w:fill="F0F0F0"/>
+      </w:pPr>
+      <w:r>
+        <w:rPr>
+          <w:rFonts w:ascii="Roboto Mono" w:hAnsi="Roboto Mono"/>
+          <w:color w:val="1B1B1B"/>
+          <w:sz w:val="17"/>
+        </w:rPr>
+        <w:t xml:space="preserve">                   (defer, with an owner and a date)</w:t>
       </w:r>
     </w:p>
     <w:p>
@@ -2760,6 +2978,26 @@
       <w:pPr>
         <w:spacing w:after="40"/>
       </w:pPr>
+    </w:p>
+    <w:p>
+      <w:pPr>
+        <w:spacing w:before="60" w:after="100"/>
+      </w:pPr>
+      <w:r>
+        <w:rPr>
+          <w:rFonts w:ascii="Public Sans" w:hAnsi="Public Sans"/>
+          <w:b/>
+          <w:color w:val="1B1B1B"/>
+        </w:rPr>
+        <w:t>Cut first if time runs short:</w:t>
+      </w:r>
+      <w:r>
+        <w:rPr>
+          <w:rFonts w:ascii="Public Sans" w:hAnsi="Public Sans"/>
+          <w:color w:val="1B1B1B"/>
+        </w:rPr>
+        <w:t xml:space="preserve"> [block]. Never the decide block or the read-back.</w:t>
+      </w:r>
     </w:p>
     <w:p>
       <w:pPr>

</xml_diff>